<commit_message>
Correccion de ficha de conocimiento
</commit_message>
<xml_diff>
--- a/docs/Ficha de Conocimiento de Dominio.docx
+++ b/docs/Ficha de Conocimiento de Dominio.docx
@@ -10,8 +10,8 @@
           <w:b w:val="1"/>
           <w:bCs w:val="1"/>
           <w:color w:val="1b365d"/>
-          <w:sz w:val="32"/>
-          <w:szCs w:val="32"/>
+          <w:sz w:val="28"/>
+          <w:szCs w:val="28"/>
         </w:rPr>
       </w:pPr>
       <w:r>
@@ -19,8 +19,8 @@
           <w:b w:val="1"/>
           <w:bCs w:val="1"/>
           <w:color w:val="1b365d"/>
-          <w:sz w:val="32"/>
-          <w:szCs w:val="32"/>
+          <w:sz w:val="28"/>
+          <w:szCs w:val="28"/>
           <w:rtl w:val="0"/>
         </w:rPr>
         <w:t xml:space="preserve">FICHA TECNICA: CONOCIMIENTO DEL DOMINIO Y CONTEXTO DEL PROYECTO</w:t>
@@ -52,7 +52,6 @@
         <w:rPr>
           <w:b w:val="1"/>
           <w:bCs w:val="1"/>
-          <w:color w:val="ee0000"/>
           <w:sz w:val="24"/>
           <w:szCs w:val="24"/>
         </w:rPr>
@@ -61,7 +60,6 @@
         <w:rPr>
           <w:b w:val="1"/>
           <w:bCs w:val="1"/>
-          <w:color w:val="ee0000"/>
           <w:sz w:val="24"/>
           <w:szCs w:val="24"/>
           <w:rtl w:val="0"/>
@@ -211,14 +209,12 @@
             <w:pPr>
               <w:spacing w:after="200" w:lineRule="auto"/>
               <w:rPr>
-                <w:color w:val="ff0000"/>
-                <w:sz w:val="19"/>
-                <w:szCs w:val="19"/>
-              </w:rPr>
-            </w:pPr>
-            <w:r>
-              <w:rPr>
-                <w:color w:val="ff0000"/>
+                <w:sz w:val="19"/>
+                <w:szCs w:val="19"/>
+              </w:rPr>
+            </w:pPr>
+            <w:r>
+              <w:rPr>
                 <w:sz w:val="19"/>
                 <w:szCs w:val="19"/>
                 <w:rtl w:val="0"/>
@@ -307,14 +303,12 @@
             <w:pPr>
               <w:spacing w:after="200" w:lineRule="auto"/>
               <w:rPr>
-                <w:color w:val="ff0000"/>
-                <w:sz w:val="19"/>
-                <w:szCs w:val="19"/>
-              </w:rPr>
-            </w:pPr>
-            <w:r>
-              <w:rPr>
-                <w:color w:val="ff0000"/>
+                <w:sz w:val="19"/>
+                <w:szCs w:val="19"/>
+              </w:rPr>
+            </w:pPr>
+            <w:r>
+              <w:rPr>
                 <w:sz w:val="19"/>
                 <w:szCs w:val="19"/>
                 <w:rtl w:val="0"/>
@@ -363,7 +357,12 @@
     <w:p>
       <w:pPr>
         <w:spacing w:after="120" w:lineRule="auto"/>
-        <w:rPr/>
+        <w:rPr>
+          <w:b w:val="1"/>
+          <w:bCs w:val="1"/>
+          <w:sz w:val="24"/>
+          <w:szCs w:val="24"/>
+        </w:rPr>
       </w:pPr>
       <w:r>
         <w:rPr>
@@ -371,23 +370,10 @@
         </w:rPr>
         <w:t xml:space="preserve"> </w:t>
       </w:r>
-    </w:p>
-    <w:p>
-      <w:pPr>
-        <w:spacing w:after="120" w:before="280" w:lineRule="auto"/>
-        <w:rPr>
-          <w:b w:val="1"/>
-          <w:bCs w:val="1"/>
-          <w:color w:val="ee0000"/>
-          <w:sz w:val="24"/>
-          <w:szCs w:val="24"/>
-        </w:rPr>
-      </w:pPr>
       <w:r>
         <w:rPr>
           <w:b w:val="1"/>
           <w:bCs w:val="1"/>
-          <w:color w:val="ee0000"/>
           <w:sz w:val="24"/>
           <w:szCs w:val="24"/>
           <w:rtl w:val="0"/>
@@ -537,14 +523,12 @@
             <w:pPr>
               <w:spacing w:after="200" w:lineRule="auto"/>
               <w:rPr>
-                <w:color w:val="ff0000"/>
-                <w:sz w:val="19"/>
-                <w:szCs w:val="19"/>
-              </w:rPr>
-            </w:pPr>
-            <w:r>
-              <w:rPr>
-                <w:color w:val="ff0000"/>
+                <w:sz w:val="19"/>
+                <w:szCs w:val="19"/>
+              </w:rPr>
+            </w:pPr>
+            <w:r>
+              <w:rPr>
                 <w:sz w:val="19"/>
                 <w:szCs w:val="19"/>
                 <w:rtl w:val="0"/>
@@ -617,14 +601,12 @@
             <w:pPr>
               <w:spacing w:after="200" w:lineRule="auto"/>
               <w:rPr>
-                <w:color w:val="ff0000"/>
-                <w:sz w:val="19"/>
-                <w:szCs w:val="19"/>
-              </w:rPr>
-            </w:pPr>
-            <w:r>
-              <w:rPr>
-                <w:color w:val="ff0000"/>
+                <w:sz w:val="19"/>
+                <w:szCs w:val="19"/>
+              </w:rPr>
+            </w:pPr>
+            <w:r>
+              <w:rPr>
                 <w:sz w:val="19"/>
                 <w:szCs w:val="19"/>
                 <w:rtl w:val="0"/>
@@ -685,18 +667,6 @@
     <w:p>
       <w:pPr>
         <w:spacing w:after="120" w:lineRule="auto"/>
-        <w:rPr/>
-      </w:pPr>
-      <w:r>
-        <w:rPr>
-          <w:rtl w:val="0"/>
-        </w:rPr>
-        <w:t xml:space="preserve"> </w:t>
-      </w:r>
-    </w:p>
-    <w:p>
-      <w:pPr>
-        <w:spacing w:after="120" w:before="280" w:lineRule="auto"/>
         <w:rPr>
           <w:b w:val="1"/>
           <w:bCs w:val="1"/>
@@ -705,6 +675,12 @@
           <w:szCs w:val="24"/>
         </w:rPr>
       </w:pPr>
+      <w:r>
+        <w:rPr>
+          <w:rtl w:val="0"/>
+        </w:rPr>
+        <w:t xml:space="preserve"> </w:t>
+      </w:r>
       <w:r>
         <w:rPr>
           <w:b w:val="1"/>
@@ -859,14 +835,12 @@
             <w:pPr>
               <w:spacing w:after="200" w:lineRule="auto"/>
               <w:rPr>
-                <w:color w:val="ff0000"/>
-                <w:sz w:val="19"/>
-                <w:szCs w:val="19"/>
-              </w:rPr>
-            </w:pPr>
-            <w:r>
-              <w:rPr>
-                <w:color w:val="ff0000"/>
+                <w:sz w:val="19"/>
+                <w:szCs w:val="19"/>
+              </w:rPr>
+            </w:pPr>
+            <w:r>
+              <w:rPr>
                 <w:sz w:val="19"/>
                 <w:szCs w:val="19"/>
                 <w:rtl w:val="0"/>
@@ -1001,7 +975,7 @@
                 <w:szCs w:val="19"/>
                 <w:rtl w:val="0"/>
               </w:rPr>
-              <w:t xml:space="preserve">FUENTE DE ENERGÍA: Tipo de fuente de energía renovable utilizada para la generación. (EOLICO, SOLAR, BIOMASA, BIOGAS, BIODIESEL, HIDRO &lt;= 50MW, DEMANDA MEM).</w:t>
+              <w:t xml:space="preserve">FUENTE DE ENERGÍA: Tipo de fuente de energía renovable utilizada para la generación. (EÓLICO, SOLAR, BIOMASA, BIOGAS, BIODIESEL, HIDRO &lt;= 50MW, DEMANDA MEM).</w:t>
               <w:br w:type="textWrapping"/>
             </w:r>
           </w:p>
@@ -1155,12 +1129,19 @@
             </w:pPr>
             <w:r>
               <w:rPr>
+                <w:sz w:val="19"/>
+                <w:szCs w:val="19"/>
+                <w:rtl w:val="0"/>
+              </w:rPr>
+              <w:t xml:space="preserve">Factores Externos</w:t>
+            </w:r>
+            <w:r>
+              <w:rPr>
                 <w:color w:val="ff0000"/>
                 <w:sz w:val="19"/>
                 <w:szCs w:val="19"/>
                 <w:rtl w:val="0"/>
               </w:rPr>
-              <w:t xml:space="preserve">Factores Externos</w:t>
               <w:br w:type="textWrapping"/>
               <w:t xml:space="preserve"> </w:t>
             </w:r>
@@ -1247,7 +1228,7 @@
     <w:tbl>
       <w:tblPr>
         <w:tblStyle w:val="Table4"/>
-        <w:tblW w:w="8880.0" w:type="dxa"/>
+        <w:tblW w:w="8895.0" w:type="dxa"/>
         <w:jc w:val="left"/>
         <w:tblBorders>
           <w:top w:color="000000" w:space="0" w:sz="0" w:val="nil"/>
@@ -1262,22 +1243,18 @@
       </w:tblPr>
       <w:tblGrid>
         <w:gridCol w:w="2175"/>
-        <w:gridCol w:w="2340"/>
-        <w:gridCol w:w="2325"/>
-        <w:gridCol w:w="2040"/>
+        <w:gridCol w:w="6720"/>
         <w:tblGridChange w:id="0">
           <w:tblGrid>
             <w:gridCol w:w="2175"/>
-            <w:gridCol w:w="2340"/>
-            <w:gridCol w:w="2325"/>
-            <w:gridCol w:w="2040"/>
+            <w:gridCol w:w="6720"/>
           </w:tblGrid>
         </w:tblGridChange>
       </w:tblGrid>
       <w:tr>
         <w:trPr>
           <w:cantSplit w:val="0"/>
-          <w:trHeight w:val="915" w:hRule="atLeast"/>
+          <w:trHeight w:val="1314.73876953125" w:hRule="atLeast"/>
           <w:tblHeader w:val="0"/>
         </w:trPr>
         <w:tc>
@@ -1313,20 +1290,25 @@
                 <w:b w:val="1"/>
                 <w:bCs w:val="1"/>
                 <w:color w:val="ffffff"/>
-                <w:sz w:val="20"/>
-                <w:szCs w:val="20"/>
-                <w:rtl w:val="0"/>
-              </w:rPr>
-              <w:t xml:space="preserve">Pregunta de Análisis</w:t>
-            </w:r>
-          </w:p>
-        </w:tc>
-        <w:tc>
-          <w:tcPr>
-            <w:tcBorders>
-              <w:top w:color="d1d5db" w:space="0" w:sz="8" w:val="single"/>
-              <w:left w:color="000000" w:space="0" w:sz="0" w:val="nil"/>
-              <w:bottom w:color="d1d5db" w:space="0" w:sz="8" w:val="single"/>
+                <w:sz w:val="19"/>
+                <w:szCs w:val="19"/>
+                <w:rtl w:val="0"/>
+              </w:rPr>
+              <w:t xml:space="preserve">N°</w:t>
+            </w:r>
+            <w:r>
+              <w:rPr>
+                <w:rtl w:val="0"/>
+              </w:rPr>
+            </w:r>
+          </w:p>
+        </w:tc>
+        <w:tc>
+          <w:tcPr>
+            <w:tcBorders>
+              <w:top w:color="d1d5db" w:space="0" w:sz="7" w:val="single"/>
+              <w:left w:color="000000" w:space="0" w:sz="0" w:val="nil"/>
+              <w:bottom w:color="d1d5db" w:space="0" w:sz="7" w:val="single"/>
               <w:right w:color="000000" w:space="0" w:sz="0" w:val="nil"/>
             </w:tcBorders>
             <w:shd w:fill="1b365d" w:val="clear"/>
@@ -1345,8 +1327,8 @@
                 <w:b w:val="1"/>
                 <w:bCs w:val="1"/>
                 <w:color w:val="ffffff"/>
-                <w:sz w:val="20"/>
-                <w:szCs w:val="20"/>
+                <w:sz w:val="19"/>
+                <w:szCs w:val="19"/>
               </w:rPr>
             </w:pPr>
             <w:r>
@@ -1354,93 +1336,11 @@
                 <w:b w:val="1"/>
                 <w:bCs w:val="1"/>
                 <w:color w:val="ffffff"/>
-                <w:sz w:val="20"/>
-                <w:szCs w:val="20"/>
-                <w:rtl w:val="0"/>
-              </w:rPr>
-              <w:t xml:space="preserve">Aporte de Valor</w:t>
-            </w:r>
-          </w:p>
-        </w:tc>
-        <w:tc>
-          <w:tcPr>
-            <w:tcBorders>
-              <w:top w:color="d1d5db" w:space="0" w:sz="8" w:val="single"/>
-              <w:left w:color="000000" w:space="0" w:sz="0" w:val="nil"/>
-              <w:bottom w:color="d1d5db" w:space="0" w:sz="8" w:val="single"/>
-              <w:right w:color="000000" w:space="0" w:sz="0" w:val="nil"/>
-            </w:tcBorders>
-            <w:shd w:fill="1b365d" w:val="clear"/>
-            <w:tcMar>
-              <w:top w:w="120.0" w:type="dxa"/>
-              <w:left w:w="160.0" w:type="dxa"/>
-              <w:bottom w:w="120.0" w:type="dxa"/>
-              <w:right w:w="160.0" w:type="dxa"/>
-            </w:tcMar>
-            <w:vAlign w:val="top"/>
-          </w:tcPr>
-          <w:p>
-            <w:pPr>
-              <w:spacing w:after="200" w:lineRule="auto"/>
-              <w:rPr>
-                <w:b w:val="1"/>
-                <w:bCs w:val="1"/>
-                <w:color w:val="ffffff"/>
-                <w:sz w:val="20"/>
-                <w:szCs w:val="20"/>
-              </w:rPr>
-            </w:pPr>
-            <w:r>
-              <w:rPr>
-                <w:b w:val="1"/>
-                <w:bCs w:val="1"/>
-                <w:color w:val="ffffff"/>
-                <w:sz w:val="20"/>
-                <w:szCs w:val="20"/>
-                <w:rtl w:val="0"/>
-              </w:rPr>
-              <w:t xml:space="preserve">Alcance</w:t>
-            </w:r>
-          </w:p>
-        </w:tc>
-        <w:tc>
-          <w:tcPr>
-            <w:tcBorders>
-              <w:top w:color="d1d5db" w:space="0" w:sz="8" w:val="single"/>
-              <w:left w:color="000000" w:space="0" w:sz="0" w:val="nil"/>
-              <w:bottom w:color="d1d5db" w:space="0" w:sz="8" w:val="single"/>
-              <w:right w:color="000000" w:space="0" w:sz="0" w:val="nil"/>
-            </w:tcBorders>
-            <w:shd w:fill="1b365d" w:val="clear"/>
-            <w:tcMar>
-              <w:top w:w="120.0" w:type="dxa"/>
-              <w:left w:w="160.0" w:type="dxa"/>
-              <w:bottom w:w="120.0" w:type="dxa"/>
-              <w:right w:w="160.0" w:type="dxa"/>
-            </w:tcMar>
-            <w:vAlign w:val="top"/>
-          </w:tcPr>
-          <w:p>
-            <w:pPr>
-              <w:spacing w:after="200" w:lineRule="auto"/>
-              <w:rPr>
-                <w:b w:val="1"/>
-                <w:bCs w:val="1"/>
-                <w:color w:val="ffffff"/>
-                <w:sz w:val="20"/>
-                <w:szCs w:val="20"/>
-              </w:rPr>
-            </w:pPr>
-            <w:r>
-              <w:rPr>
-                <w:b w:val="1"/>
-                <w:bCs w:val="1"/>
-                <w:color w:val="ffffff"/>
-                <w:sz w:val="20"/>
-                <w:szCs w:val="20"/>
-                <w:rtl w:val="0"/>
-              </w:rPr>
-              <w:t xml:space="preserve">Enfoque</w:t>
+                <w:sz w:val="19"/>
+                <w:szCs w:val="19"/>
+                <w:rtl w:val="0"/>
+              </w:rPr>
+              <w:t xml:space="preserve">Pregunta de Investigación Seleccionada</w:t>
             </w:r>
           </w:p>
         </w:tc>
@@ -1448,7 +1348,7 @@
       <w:tr>
         <w:trPr>
           <w:cantSplit w:val="0"/>
-          <w:trHeight w:val="2610" w:hRule="atLeast"/>
+          <w:trHeight w:val="1785" w:hRule="atLeast"/>
           <w:tblHeader w:val="0"/>
         </w:trPr>
         <w:tc>
@@ -1479,12 +1379,16 @@
             </w:pPr>
             <w:r>
               <w:rPr>
-                <w:color w:val="00ff00"/>
-                <w:sz w:val="19"/>
-                <w:szCs w:val="19"/>
-                <w:rtl w:val="0"/>
-              </w:rPr>
-              <w:t xml:space="preserve">1. ¿Cómo ha evolucionado la participación de las energías renovables respecto a la Demanda Total del MEM entre 2011 y 2026?</w:t>
+                <w:sz w:val="18"/>
+                <w:szCs w:val="18"/>
+                <w:rtl w:val="0"/>
+              </w:rPr>
+              <w:t xml:space="preserve">Pregunta 1</w:t>
+            </w:r>
+            <w:r>
+              <w:rPr>
+                <w:rtl w:val="0"/>
+              </w:rPr>
             </w:r>
           </w:p>
         </w:tc>
@@ -1507,97 +1411,28 @@
           </w:tcPr>
           <w:p>
             <w:pPr>
-              <w:spacing w:after="200" w:lineRule="auto"/>
-              <w:rPr>
-                <w:color w:val="00ff00"/>
-                <w:sz w:val="19"/>
-                <w:szCs w:val="19"/>
-              </w:rPr>
-            </w:pPr>
-            <w:r>
-              <w:rPr>
-                <w:color w:val="00ff00"/>
-                <w:sz w:val="19"/>
-                <w:szCs w:val="19"/>
-                <w:rtl w:val="0"/>
-              </w:rPr>
-              <w:t xml:space="preserve">Permite evaluar cuantitativamente el cumplimiento de los objetivos de transición energética nacionales (Ley 27.191) y el crecimiento real de las renovables frente a la demanda eléctrica global del país.</w:t>
-            </w:r>
-          </w:p>
-        </w:tc>
-        <w:tc>
-          <w:tcPr>
-            <w:tcBorders>
-              <w:top w:color="000000" w:space="0" w:sz="0" w:val="nil"/>
-              <w:left w:color="000000" w:space="0" w:sz="0" w:val="nil"/>
-              <w:bottom w:color="d1d5db" w:space="0" w:sz="8" w:val="single"/>
-              <w:right w:color="000000" w:space="0" w:sz="0" w:val="nil"/>
-            </w:tcBorders>
-            <w:shd w:fill="ffffff" w:val="clear"/>
-            <w:tcMar>
-              <w:top w:w="100.0" w:type="dxa"/>
-              <w:left w:w="160.0" w:type="dxa"/>
-              <w:bottom w:w="100.0" w:type="dxa"/>
-              <w:right w:w="160.0" w:type="dxa"/>
-            </w:tcMar>
-            <w:vAlign w:val="top"/>
-          </w:tcPr>
-          <w:p>
-            <w:pPr>
-              <w:spacing w:after="200" w:lineRule="auto"/>
-              <w:rPr>
-                <w:color w:val="00ff00"/>
-                <w:sz w:val="19"/>
-                <w:szCs w:val="19"/>
-              </w:rPr>
-            </w:pPr>
-            <w:r>
-              <w:rPr>
-                <w:color w:val="00ff00"/>
-                <w:sz w:val="19"/>
-                <w:szCs w:val="19"/>
-                <w:rtl w:val="0"/>
-              </w:rPr>
-              <w:t xml:space="preserve">Temporal: 2011 - 2026</w:t>
-              <w:br w:type="textWrapping"/>
-              <w:t xml:space="preserve"> Territorial: Nacional (SADI / MEM)</w:t>
-            </w:r>
-          </w:p>
-        </w:tc>
-        <w:tc>
-          <w:tcPr>
-            <w:tcBorders>
-              <w:top w:color="000000" w:space="0" w:sz="0" w:val="nil"/>
-              <w:left w:color="000000" w:space="0" w:sz="0" w:val="nil"/>
-              <w:bottom w:color="d1d5db" w:space="0" w:sz="8" w:val="single"/>
-              <w:right w:color="000000" w:space="0" w:sz="0" w:val="nil"/>
-            </w:tcBorders>
-            <w:shd w:fill="ffffff" w:val="clear"/>
-            <w:tcMar>
-              <w:top w:w="100.0" w:type="dxa"/>
-              <w:left w:w="160.0" w:type="dxa"/>
-              <w:bottom w:w="100.0" w:type="dxa"/>
-              <w:right w:w="160.0" w:type="dxa"/>
-            </w:tcMar>
-            <w:vAlign w:val="top"/>
-          </w:tcPr>
-          <w:p>
-            <w:pPr>
-              <w:spacing w:after="200" w:lineRule="auto"/>
-              <w:rPr>
-                <w:color w:val="00ff00"/>
-                <w:sz w:val="19"/>
-                <w:szCs w:val="19"/>
-              </w:rPr>
-            </w:pPr>
-            <w:r>
-              <w:rPr>
-                <w:color w:val="00ff00"/>
-                <w:sz w:val="19"/>
-                <w:szCs w:val="19"/>
-                <w:rtl w:val="0"/>
-              </w:rPr>
-              <w:t xml:space="preserve">Perspectiva macroestratégica del balance energético. Se espera determinar la tasa de cobertura de la demanda por tecnología año a año.</w:t>
+              <w:ind w:left="0" w:firstLine="0"/>
+              <w:rPr/>
+            </w:pPr>
+            <w:r>
+              <w:rPr>
+                <w:rtl w:val="0"/>
+              </w:rPr>
+              <w:t xml:space="preserve">¿Cuáles fuentes de energía renovables han tenido un mayor crecimiento?</w:t>
+            </w:r>
+          </w:p>
+          <w:p>
+            <w:pPr>
+              <w:spacing w:after="200" w:lineRule="auto"/>
+              <w:rPr>
+                <w:sz w:val="19"/>
+                <w:szCs w:val="19"/>
+              </w:rPr>
+            </w:pPr>
+            <w:r>
+              <w:rPr>
+                <w:rtl w:val="0"/>
+              </w:rPr>
             </w:r>
           </w:p>
         </w:tc>
@@ -1605,7 +1440,7 @@
       <w:tr>
         <w:trPr>
           <w:cantSplit w:val="0"/>
-          <w:trHeight w:val="2820" w:hRule="atLeast"/>
+          <w:trHeight w:val="1845" w:hRule="atLeast"/>
           <w:tblHeader w:val="0"/>
         </w:trPr>
         <w:tc>
@@ -1636,12 +1471,16 @@
             </w:pPr>
             <w:r>
               <w:rPr>
-                <w:color w:val="00ff00"/>
-                <w:sz w:val="19"/>
-                <w:szCs w:val="19"/>
-                <w:rtl w:val="0"/>
-              </w:rPr>
-              <w:t xml:space="preserve">2. ¿Cuáles son las regiones y provincias con mayor concentración de generación eólica y solar, y cómo ha impactado el desarrollo del programa RenovAr y la modalidad MATER en su distribución?</w:t>
+                <w:sz w:val="18"/>
+                <w:szCs w:val="18"/>
+                <w:rtl w:val="0"/>
+              </w:rPr>
+              <w:t xml:space="preserve">Pregunta 2</w:t>
+            </w:r>
+            <w:r>
+              <w:rPr>
+                <w:rtl w:val="0"/>
+              </w:rPr>
             </w:r>
           </w:p>
         </w:tc>
@@ -1664,97 +1503,22 @@
           </w:tcPr>
           <w:p>
             <w:pPr>
-              <w:spacing w:after="200" w:lineRule="auto"/>
-              <w:rPr>
-                <w:color w:val="00ff00"/>
-                <w:sz w:val="19"/>
-                <w:szCs w:val="19"/>
-              </w:rPr>
-            </w:pPr>
-            <w:r>
-              <w:rPr>
-                <w:color w:val="00ff00"/>
-                <w:sz w:val="19"/>
-                <w:szCs w:val="19"/>
-                <w:rtl w:val="0"/>
-              </w:rPr>
-              <w:t xml:space="preserve">Aporta visibilidad geográfica sobre la descentralización de la matriz, identificando los polos energéticos regionales y la efectividad de los incentivos públicos vs. contratos privados (MATER).</w:t>
-            </w:r>
-          </w:p>
-        </w:tc>
-        <w:tc>
-          <w:tcPr>
-            <w:tcBorders>
-              <w:top w:color="000000" w:space="0" w:sz="0" w:val="nil"/>
-              <w:left w:color="000000" w:space="0" w:sz="0" w:val="nil"/>
-              <w:bottom w:color="d1d5db" w:space="0" w:sz="8" w:val="single"/>
-              <w:right w:color="000000" w:space="0" w:sz="0" w:val="nil"/>
-            </w:tcBorders>
-            <w:shd w:fill="f9fafb" w:val="clear"/>
-            <w:tcMar>
-              <w:top w:w="100.0" w:type="dxa"/>
-              <w:left w:w="160.0" w:type="dxa"/>
-              <w:bottom w:w="100.0" w:type="dxa"/>
-              <w:right w:w="160.0" w:type="dxa"/>
-            </w:tcMar>
-            <w:vAlign w:val="top"/>
-          </w:tcPr>
-          <w:p>
-            <w:pPr>
-              <w:spacing w:after="200" w:lineRule="auto"/>
-              <w:rPr>
-                <w:color w:val="00ff00"/>
-                <w:sz w:val="19"/>
-                <w:szCs w:val="19"/>
-              </w:rPr>
-            </w:pPr>
-            <w:r>
-              <w:rPr>
-                <w:color w:val="00ff00"/>
-                <w:sz w:val="19"/>
-                <w:szCs w:val="19"/>
-                <w:rtl w:val="0"/>
-              </w:rPr>
-              <w:t xml:space="preserve">Territorial: Regiones y Provincias de Argentina</w:t>
-              <w:br w:type="textWrapping"/>
-              <w:t xml:space="preserve"> Poblacional/Económico: Mercado Eléctrico</w:t>
-            </w:r>
-          </w:p>
-        </w:tc>
-        <w:tc>
-          <w:tcPr>
-            <w:tcBorders>
-              <w:top w:color="000000" w:space="0" w:sz="0" w:val="nil"/>
-              <w:left w:color="000000" w:space="0" w:sz="0" w:val="nil"/>
-              <w:bottom w:color="d1d5db" w:space="0" w:sz="8" w:val="single"/>
-              <w:right w:color="000000" w:space="0" w:sz="0" w:val="nil"/>
-            </w:tcBorders>
-            <w:shd w:fill="f9fafb" w:val="clear"/>
-            <w:tcMar>
-              <w:top w:w="100.0" w:type="dxa"/>
-              <w:left w:w="160.0" w:type="dxa"/>
-              <w:bottom w:w="100.0" w:type="dxa"/>
-              <w:right w:w="160.0" w:type="dxa"/>
-            </w:tcMar>
-            <w:vAlign w:val="top"/>
-          </w:tcPr>
-          <w:p>
-            <w:pPr>
-              <w:spacing w:after="200" w:lineRule="auto"/>
-              <w:rPr>
-                <w:color w:val="00ff00"/>
-                <w:sz w:val="19"/>
-                <w:szCs w:val="19"/>
-              </w:rPr>
-            </w:pPr>
-            <w:r>
-              <w:rPr>
-                <w:color w:val="00ff00"/>
-                <w:sz w:val="19"/>
-                <w:szCs w:val="19"/>
-                <w:rtl w:val="0"/>
-              </w:rPr>
-              <w:t xml:space="preserve">Perspectiva geoeconómica y regulatoria. Se busca analizar el impacto de las diferentes modalidades de contratación (Nueva Generación) en el territorio nacional.</w:t>
+              <w:ind w:left="0" w:firstLine="0"/>
+              <w:rPr>
+                <w:sz w:val="19"/>
+                <w:szCs w:val="19"/>
+              </w:rPr>
+            </w:pPr>
+            <w:r>
+              <w:rPr>
+                <w:rtl w:val="0"/>
+              </w:rPr>
+              <w:t xml:space="preserve">¿Cuáles son las regiones con mayor producción de energía renovable?</w:t>
+            </w:r>
+            <w:r>
+              <w:rPr>
+                <w:rtl w:val="0"/>
+              </w:rPr>
             </w:r>
           </w:p>
         </w:tc>
@@ -1762,7 +1526,7 @@
       <w:tr>
         <w:trPr>
           <w:cantSplit w:val="0"/>
-          <w:trHeight w:val="2385" w:hRule="atLeast"/>
+          <w:trHeight w:val="1920" w:hRule="atLeast"/>
           <w:tblHeader w:val="0"/>
         </w:trPr>
         <w:tc>
@@ -1793,12 +1557,16 @@
             </w:pPr>
             <w:r>
               <w:rPr>
-                <w:color w:val="00ff00"/>
-                <w:sz w:val="19"/>
-                <w:szCs w:val="19"/>
-                <w:rtl w:val="0"/>
-              </w:rPr>
-              <w:t xml:space="preserve">3. ¿Existe un patrón estacional diferenciado en la producción de energía según la fuente (Eólica vs. Solar vs. Hidro/Biomasa)?</w:t>
+                <w:sz w:val="18"/>
+                <w:szCs w:val="18"/>
+                <w:rtl w:val="0"/>
+              </w:rPr>
+              <w:t xml:space="preserve">Pregunta 3</w:t>
+            </w:r>
+            <w:r>
+              <w:rPr>
+                <w:rtl w:val="0"/>
+              </w:rPr>
             </w:r>
           </w:p>
         </w:tc>
@@ -1821,97 +1589,28 @@
           </w:tcPr>
           <w:p>
             <w:pPr>
-              <w:spacing w:after="200" w:lineRule="auto"/>
-              <w:rPr>
-                <w:color w:val="00ff00"/>
-                <w:sz w:val="19"/>
-                <w:szCs w:val="19"/>
-              </w:rPr>
-            </w:pPr>
-            <w:r>
-              <w:rPr>
-                <w:color w:val="00ff00"/>
-                <w:sz w:val="19"/>
-                <w:szCs w:val="19"/>
-                <w:rtl w:val="0"/>
-              </w:rPr>
-              <w:t xml:space="preserve">Ayuda a comprender la complementariedad entre los diferentes recursos renovables a lo largo de los meses del año para la planificación de la estabilidad de la red eléctrica.</w:t>
-            </w:r>
-          </w:p>
-        </w:tc>
-        <w:tc>
-          <w:tcPr>
-            <w:tcBorders>
-              <w:top w:color="000000" w:space="0" w:sz="0" w:val="nil"/>
-              <w:left w:color="000000" w:space="0" w:sz="0" w:val="nil"/>
-              <w:bottom w:color="d1d5db" w:space="0" w:sz="8" w:val="single"/>
-              <w:right w:color="000000" w:space="0" w:sz="0" w:val="nil"/>
-            </w:tcBorders>
-            <w:shd w:fill="ffffff" w:val="clear"/>
-            <w:tcMar>
-              <w:top w:w="100.0" w:type="dxa"/>
-              <w:left w:w="160.0" w:type="dxa"/>
-              <w:bottom w:w="100.0" w:type="dxa"/>
-              <w:right w:w="160.0" w:type="dxa"/>
-            </w:tcMar>
-            <w:vAlign w:val="top"/>
-          </w:tcPr>
-          <w:p>
-            <w:pPr>
-              <w:spacing w:after="200" w:lineRule="auto"/>
-              <w:rPr>
-                <w:color w:val="00ff00"/>
-                <w:sz w:val="19"/>
-                <w:szCs w:val="19"/>
-              </w:rPr>
-            </w:pPr>
-            <w:r>
-              <w:rPr>
-                <w:color w:val="00ff00"/>
-                <w:sz w:val="19"/>
-                <w:szCs w:val="19"/>
-                <w:rtl w:val="0"/>
-              </w:rPr>
-              <w:t xml:space="preserve">Temporal: Mensual acumulado (2011 - 2026)</w:t>
-              <w:br w:type="textWrapping"/>
-              <w:t xml:space="preserve"> Poblacional: Centros de generación por tecnología</w:t>
-            </w:r>
-          </w:p>
-        </w:tc>
-        <w:tc>
-          <w:tcPr>
-            <w:tcBorders>
-              <w:top w:color="000000" w:space="0" w:sz="0" w:val="nil"/>
-              <w:left w:color="000000" w:space="0" w:sz="0" w:val="nil"/>
-              <w:bottom w:color="d1d5db" w:space="0" w:sz="8" w:val="single"/>
-              <w:right w:color="000000" w:space="0" w:sz="0" w:val="nil"/>
-            </w:tcBorders>
-            <w:shd w:fill="ffffff" w:val="clear"/>
-            <w:tcMar>
-              <w:top w:w="100.0" w:type="dxa"/>
-              <w:left w:w="160.0" w:type="dxa"/>
-              <w:bottom w:w="100.0" w:type="dxa"/>
-              <w:right w:w="160.0" w:type="dxa"/>
-            </w:tcMar>
-            <w:vAlign w:val="top"/>
-          </w:tcPr>
-          <w:p>
-            <w:pPr>
-              <w:spacing w:after="200" w:lineRule="auto"/>
-              <w:rPr>
-                <w:color w:val="00ff00"/>
-                <w:sz w:val="19"/>
-                <w:szCs w:val="19"/>
-              </w:rPr>
-            </w:pPr>
-            <w:r>
-              <w:rPr>
-                <w:color w:val="00ff00"/>
-                <w:sz w:val="19"/>
-                <w:szCs w:val="19"/>
-                <w:rtl w:val="0"/>
-              </w:rPr>
-              <w:t xml:space="preserve">Perspectiva técnica de operación de red. Se busca identificar picos estacionales de producción y su correlación entre recursos renovables.</w:t>
+              <w:ind w:left="0" w:firstLine="0"/>
+              <w:rPr/>
+            </w:pPr>
+            <w:r>
+              <w:rPr>
+                <w:rtl w:val="0"/>
+              </w:rPr>
+              <w:t xml:space="preserve">¿Alguna provincia tuvo un decrecimiento en los últimos años en su generación de energía?</w:t>
+            </w:r>
+          </w:p>
+          <w:p>
+            <w:pPr>
+              <w:spacing w:after="200" w:lineRule="auto"/>
+              <w:rPr>
+                <w:sz w:val="19"/>
+                <w:szCs w:val="19"/>
+              </w:rPr>
+            </w:pPr>
+            <w:r>
+              <w:rPr>
+                <w:rtl w:val="0"/>
+              </w:rPr>
             </w:r>
           </w:p>
         </w:tc>
@@ -1926,7 +1625,17 @@
         <w:rPr>
           <w:rtl w:val="0"/>
         </w:rPr>
-        <w:t xml:space="preserve"> </w:t>
+      </w:r>
+    </w:p>
+    <w:p>
+      <w:pPr>
+        <w:spacing w:after="120" w:lineRule="auto"/>
+        <w:rPr/>
+      </w:pPr>
+      <w:r>
+        <w:rPr>
+          <w:rtl w:val="0"/>
+        </w:rPr>
       </w:r>
     </w:p>
     <w:p>
@@ -2101,12 +1810,19 @@
             </w:pPr>
             <w:r>
               <w:rPr>
+                <w:sz w:val="19"/>
+                <w:szCs w:val="19"/>
+                <w:rtl w:val="0"/>
+              </w:rPr>
+              <w:t xml:space="preserve">Limitaciones Identificadas</w:t>
+            </w:r>
+            <w:r>
+              <w:rPr>
                 <w:color w:val="ff0000"/>
                 <w:sz w:val="19"/>
                 <w:szCs w:val="19"/>
                 <w:rtl w:val="0"/>
               </w:rPr>
-              <w:t xml:space="preserve">Limitaciones Identificadas</w:t>
               <w:br w:type="textWrapping"/>
               <w:t xml:space="preserve"> </w:t>
             </w:r>
@@ -2163,16 +1879,6 @@
           <w:rtl w:val="0"/>
         </w:rPr>
         <w:t xml:space="preserve"> </w:t>
-      </w:r>
-    </w:p>
-    <w:p>
-      <w:pPr>
-        <w:rPr/>
-      </w:pPr>
-      <w:r>
-        <w:rPr>
-          <w:rtl w:val="0"/>
-        </w:rPr>
       </w:r>
     </w:p>
     <w:sectPr>

</xml_diff>